<commit_message>
Add verified base paper (Nolasco et al. 2023) to ESC-50 report; restructure deck to match reference order
Co-Authored-By: Claude Sonnet 5.5 <noreply@anthropic.com>
Claude-Session: https://claude.ai/code/session_012DKUQj8phYpnuRrxK5eNsm
</commit_message>
<xml_diff>
--- a/esc50_matching/docs/report.docx
+++ b/esc50_matching/docs/report.docx
@@ -339,7 +339,7 @@
           <w:b w:val="0"/>
           <w:i w:val="0"/>
         </w:rPr>
-        <w:t>Many sounds worth detecting, a door knock, a siren, a dog bark, have a characteristic waveform. If one example of the sound is known, a simple way to find it in a longer recording is template matching: slide the template along the recording and measure at every position how similar the two are. The similarity measure used here is normalised cross-correlation (NCC). Plain cross-correlation grows with loudness; dividing by the energy of the template and of the current window of the recording makes the score independent of volume and bounded by 1, so a single threshold can be used [4], [7].</w:t>
+        <w:t>Many sounds worth detecting, a door knock, a siren, a dog bark, have a characteristic waveform. If one example of the sound is known, a simple way to find it in a longer recording is template matching: slide the template along the recording and measure at every position how similar the two are. The similarity measure used here is normalised cross-correlation (NCC). Plain cross-correlation grows with loudness; dividing by the energy of the template and of the current window of the recording makes the score independent of volume and bounded by 1, so a single threshold can be used [4], [7]. Template matching by correlation is a long-used baseline for detecting a known sound from few examples [17], [18].</w:t>
       </w:r>
     </w:p>
     <w:p>
@@ -1032,23 +1032,7 @@
           <w:i/>
           <w:sz w:val="20"/>
         </w:rPr>
-        <w:t xml:space="preserve">The base paper (a recent open-access paper on template matching or correlation-based sound event detection) could </w:t>
-      </w:r>
-      <w:r>
-        <w:rPr>
-          <w:b/>
-          <w:i/>
-          <w:sz w:val="20"/>
-        </w:rPr>
-        <w:t>not be verified</w:t>
-      </w:r>
-      <w:r>
-        <w:rPr>
-          <w:b w:val="0"/>
-          <w:i/>
-          <w:sz w:val="20"/>
-        </w:rPr>
-        <w:t xml:space="preserve"> within the time limit: this session had no access to publisher or index websites to check authors, year, venue and DOI, and no unverified paper is cited. It is left as a highlighted placeholder for the student to fill in. The other entries are listed from latest to oldest; their summaries describe what each source is known for, not a full-text review.</w:t>
+        <w:t>Base paper: Nolasco et al. [17]. Its title, author list, journal, volume, article number and DOI were checked against repository records (journal volume 77, article 102258); the paper is freely available as an arXiv preprint. Its content is described here from its abstract and from the descriptions of its template-matching baseline; the full text was not read in this session, so no detailed result of that paper is quoted. [18] is a July 2026 preprint, summarised from its abstract only. The other entries are listed from latest to oldest and summarise what each source is known for, not a full-text review.</w:t>
       </w:r>
     </w:p>
     <w:p>
@@ -1199,9 +1183,8 @@
                 <w:b w:val="0"/>
                 <w:i w:val="0"/>
                 <w:sz w:val="16"/>
-                <w:highlight w:val="yellow"/>
               </w:rPr>
-              <w:t>[Base paper to be verified by the student]</w:t>
+              <w:t>Learning to detect an animal sound from five examples [17] (BASE PAPER)</w:t>
             </w:r>
           </w:p>
         </w:tc>
@@ -1220,9 +1203,8 @@
                 <w:b w:val="0"/>
                 <w:i w:val="0"/>
                 <w:sz w:val="16"/>
-                <w:highlight w:val="yellow"/>
               </w:rPr>
-              <w:t>[Year]</w:t>
+              <w:t>2023</w:t>
             </w:r>
           </w:p>
         </w:tc>
@@ -1241,9 +1223,8 @@
                 <w:b w:val="0"/>
                 <w:i w:val="0"/>
                 <w:sz w:val="16"/>
-                <w:highlight w:val="yellow"/>
               </w:rPr>
-              <w:t>[Venue / DOI]</w:t>
+              <w:t>Ecological Informatics 77, 102258; doi:10.1016/j.ecoinf.2023.102258; arXiv:2305.13210 (open)</w:t>
             </w:r>
           </w:p>
         </w:tc>
@@ -1262,9 +1243,8 @@
                 <w:b w:val="0"/>
                 <w:i w:val="0"/>
                 <w:sz w:val="16"/>
-                <w:highlight w:val="yellow"/>
               </w:rPr>
-              <w:t>[Benefits]</w:t>
+              <w:t>Treats sound event detection from only a few examples of the target sound, which is exactly the one-example setting of this project. Uses spectrogram cross-correlation template matching as a traditional baseline and reports that few-shot learning outperforms such signal-processing detectors.</w:t>
             </w:r>
           </w:p>
         </w:tc>
@@ -1283,9 +1263,113 @@
                 <w:b w:val="0"/>
                 <w:i w:val="0"/>
                 <w:sz w:val="16"/>
-                <w:highlight w:val="yellow"/>
               </w:rPr>
-              <w:t>[Future scope]</w:t>
+              <w:t>Our waveform NCC shows the same limitation: it finds exact repeats but not different instances. Natural next steps: correlate spectrograms or learned embeddings instead of raw samples.</w:t>
+            </w:r>
+          </w:p>
+        </w:tc>
+      </w:tr>
+      <w:tr>
+        <w:trPr>
+          <w:cantSplit w:val="true"/>
+        </w:trPr>
+        <w:tc>
+          <w:tcPr>
+            <w:tcW w:type="dxa" w:w="2160"/>
+          </w:tcPr>
+          <w:p>
+            <w:pPr>
+              <w:keepNext/>
+              <w:spacing w:after="0"/>
+            </w:pPr>
+            <w:r/>
+            <w:r>
+              <w:rPr>
+                <w:b w:val="0"/>
+                <w:i w:val="0"/>
+                <w:sz w:val="16"/>
+              </w:rPr>
+              <w:t>Algorithmic Accuracy as a Motivational Driver in Robot-Mediated Learning (cross-correlation vs CNN sound detection) [18]</w:t>
+            </w:r>
+          </w:p>
+        </w:tc>
+        <w:tc>
+          <w:tcPr>
+            <w:tcW w:type="dxa" w:w="720"/>
+          </w:tcPr>
+          <w:p>
+            <w:pPr>
+              <w:keepNext/>
+              <w:spacing w:after="0"/>
+            </w:pPr>
+            <w:r/>
+            <w:r>
+              <w:rPr>
+                <w:b w:val="0"/>
+                <w:i w:val="0"/>
+                <w:sz w:val="16"/>
+              </w:rPr>
+              <w:t>2026</w:t>
+            </w:r>
+          </w:p>
+        </w:tc>
+        <w:tc>
+          <w:tcPr>
+            <w:tcW w:type="dxa" w:w="1368"/>
+          </w:tcPr>
+          <w:p>
+            <w:pPr>
+              <w:keepNext/>
+              <w:spacing w:after="0"/>
+            </w:pPr>
+            <w:r/>
+            <w:r>
+              <w:rPr>
+                <w:b w:val="0"/>
+                <w:i w:val="0"/>
+                <w:sz w:val="16"/>
+              </w:rPr>
+              <w:t>arXiv:2607.16299 (preprint)</w:t>
+            </w:r>
+          </w:p>
+        </w:tc>
+        <w:tc>
+          <w:tcPr>
+            <w:tcW w:type="dxa" w:w="2880"/>
+          </w:tcPr>
+          <w:p>
+            <w:pPr>
+              <w:keepNext/>
+              <w:spacing w:after="0"/>
+            </w:pPr>
+            <w:r/>
+            <w:r>
+              <w:rPr>
+                <w:b w:val="0"/>
+                <w:i w:val="0"/>
+                <w:sz w:val="16"/>
+              </w:rPr>
+              <w:t>Uses a normalised-cross-correlation detector with a fixed threshold against a stored reference sound to detect buzzer sounds, and compares it with a CNN in a classroom game.</w:t>
+            </w:r>
+          </w:p>
+        </w:tc>
+        <w:tc>
+          <w:tcPr>
+            <w:tcW w:type="dxa" w:w="2232"/>
+          </w:tcPr>
+          <w:p>
+            <w:pPr>
+              <w:keepNext/>
+              <w:spacing w:after="0"/>
+            </w:pPr>
+            <w:r/>
+            <w:r>
+              <w:rPr>
+                <w:b w:val="0"/>
+                <w:i w:val="0"/>
+                <w:sz w:val="16"/>
+              </w:rPr>
+              <w:t>Preprint, abstract-level reading only; its claims are not independently checked here. Detection of one fixed, stereotyped sound, not different instances of a class.</w:t>
             </w:r>
           </w:p>
         </w:tc>
@@ -5136,7 +5220,7 @@
           <w:b w:val="0"/>
           <w:i w:val="0"/>
         </w:rPr>
-        <w:t>Scores of true and other-class clips overlap strongly (Section 6.3), so a better representation (for example spectrogram features) would be needed to recognise a class from one example; that is outside this project's scope.</w:t>
+        <w:t>Scores of true and other-class clips overlap strongly (Section 6.3), so a better representation (for example spectrogram features or learned few-shot models, as in the base paper [17]) would be needed to recognise a class from one example; that is outside this project's scope.</w:t>
       </w:r>
     </w:p>
     <w:p>
@@ -5480,22 +5564,39 @@
       </w:r>
     </w:p>
     <w:p>
+      <w:pPr>
+        <w:tabs>
+          <w:tab w:pos="576" w:val="left"/>
+        </w:tabs>
+        <w:ind w:left="576" w:hanging="576"/>
+      </w:pPr>
       <w:r>
         <w:rPr>
           <w:b w:val="0"/>
           <w:i w:val="0"/>
           <w:sz w:val="20"/>
         </w:rPr>
-        <w:t xml:space="preserve">Base paper: </w:t>
+        <w:t>[17]</w:t>
+        <w:tab/>
+        <w:t>I. Nolasco, S. Singh, V. Morfi, V. Lostanlen, A. Strandburg-Peshkin, E. Vidana-Vila, L. Gill, H. Pamula, H. Whitehead, I. Kiskin, F. H. Jensen, J. Morford, M. G. Emmerson, E. Versace, E. Grout, H. Liu, B. Ghani and D. Stowell, "Learning to detect an animal sound from five examples", Ecological Informatics, vol. 77, art. 102258, 2023, doi:10.1016/j.ecoinf.2023.102258 (BASE PAPER; also on arXiv:2305.13210).</w:t>
       </w:r>
+    </w:p>
+    <w:p>
+      <w:pPr>
+        <w:tabs>
+          <w:tab w:pos="576" w:val="left"/>
+        </w:tabs>
+        <w:ind w:left="576" w:hanging="576"/>
+      </w:pPr>
       <w:r>
         <w:rPr>
           <w:b w:val="0"/>
           <w:i w:val="0"/>
           <w:sz w:val="20"/>
-          <w:highlight w:val="yellow"/>
         </w:rPr>
-        <w:t>[Base paper to be verified by the student]</w:t>
+        <w:t>[18]</w:t>
+        <w:tab/>
+        <w:t>R. Tutul, I. Buchem and N. Pinkwart, "Algorithmic Accuracy as a Motivational Driver in Robot-Mediated Learning: A Comparative Study of Cross-Correlation and CNN-Based Sound Detection in an Interactive Quiz Game", arXiv:2607.16299, July 2026 (preprint).</w:t>
       </w:r>
     </w:p>
     <w:sectPr>

</xml_diff>

<commit_message>
Base paper is now the 2026 Tutul et al. preprint; literature study limited to 2020+ papers, latest to oldest
Co-Authored-By: Claude Sonnet 5.5 <noreply@anthropic.com>
Claude-Session: https://claude.ai/code/session_012DKUQj8phYpnuRrxK5eNsm
</commit_message>
<xml_diff>
--- a/esc50_matching/docs/report.docx
+++ b/esc50_matching/docs/report.docx
@@ -339,7 +339,7 @@
           <w:b w:val="0"/>
           <w:i w:val="0"/>
         </w:rPr>
-        <w:t>Many sounds worth detecting, a door knock, a siren, a dog bark, have a characteristic waveform. If one example of the sound is known, a simple way to find it in a longer recording is template matching: slide the template along the recording and measure at every position how similar the two are. The similarity measure used here is normalised cross-correlation (NCC). Plain cross-correlation grows with loudness; dividing by the energy of the template and of the current window of the recording makes the score independent of volume and bounded by 1, so a single threshold can be used [4], [7]. Template matching by correlation is a long-used baseline for detecting a known sound from few examples [17], [18].</w:t>
+        <w:t>Many sounds worth detecting, a door knock, a siren, a dog bark, have a characteristic waveform. If one example of the sound is known, a simple way to find it in a longer recording is template matching: slide the template along the recording and measure at every position how similar the two are. The similarity measure used here is normalised cross-correlation (NCC). Plain cross-correlation grows with loudness; dividing by the energy of the template and of the current window of the recording makes the score independent of volume and bounded by 1, so a single threshold can be used. Template matching by correlation is a simple baseline for detecting a known sound from few examples [2], [1].</w:t>
       </w:r>
     </w:p>
     <w:p>
@@ -348,7 +348,7 @@
           <w:b w:val="0"/>
           <w:i w:val="0"/>
         </w:rPr>
-        <w:t>To score such a detector honestly the true positions must be known. This project builds test recordings by joining clips from the ESC-50 dataset [1], [2] with silences between them, so the exact start and end of every clip is known and each detection can be marked correct or false.</w:t>
+        <w:t>To score such a detector honestly the true positions must be known. This project builds test recordings by joining clips from the ESC-50 dataset [6], [7] with silences between them, so the exact start and end of every clip is known and each detection can be marked correct or false.</w:t>
       </w:r>
     </w:p>
     <w:p>
@@ -496,7 +496,7 @@
                 <w:i w:val="0"/>
                 <w:sz w:val="18"/>
               </w:rPr>
-              <w:t>Counted from meta/esc50.csv [2]</w:t>
+              <w:t>Counted from meta/esc50.csv [7]</w:t>
             </w:r>
           </w:p>
         </w:tc>
@@ -558,7 +558,7 @@
                 <w:i w:val="0"/>
                 <w:sz w:val="18"/>
               </w:rPr>
-              <w:t>Counted from meta/esc50.csv [2]</w:t>
+              <w:t>Counted from meta/esc50.csv [7]</w:t>
             </w:r>
           </w:p>
         </w:tc>
@@ -620,7 +620,7 @@
                 <w:i w:val="0"/>
                 <w:sz w:val="18"/>
               </w:rPr>
-              <w:t>Counted from meta/esc50.csv [2]</w:t>
+              <w:t>Counted from meta/esc50.csv [7]</w:t>
             </w:r>
           </w:p>
         </w:tc>
@@ -682,7 +682,7 @@
                 <w:i w:val="0"/>
                 <w:sz w:val="18"/>
               </w:rPr>
-              <w:t>meta/esc50.csv [2]</w:t>
+              <w:t>meta/esc50.csv [7]</w:t>
             </w:r>
           </w:p>
         </w:tc>
@@ -744,7 +744,7 @@
                 <w:i w:val="0"/>
                 <w:sz w:val="18"/>
               </w:rPr>
-              <w:t>Dataset description [1], [2]</w:t>
+              <w:t>Dataset description [6], [7]</w:t>
             </w:r>
           </w:p>
         </w:tc>
@@ -868,7 +868,7 @@
                 <w:i w:val="0"/>
                 <w:sz w:val="18"/>
               </w:rPr>
-              <w:t>Chosen from the 50 class names in the CSV [2]</w:t>
+              <w:t>Chosen from the 50 class names in the CSV [7]</w:t>
             </w:r>
           </w:p>
         </w:tc>
@@ -992,7 +992,7 @@
                 <w:i w:val="0"/>
                 <w:sz w:val="18"/>
               </w:rPr>
-              <w:t>[3]; clips originate from Freesound [16]</w:t>
+              <w:t>[8]; clips originate from Freesound [9]</w:t>
             </w:r>
           </w:p>
         </w:tc>
@@ -1009,7 +1009,7 @@
           <w:b w:val="0"/>
           <w:i w:val="0"/>
         </w:rPr>
-        <w:t>The data are used under the CC BY-NC 3.0 licence [3] for this non-commercial college project, with attribution to Piczak [1], [2].</w:t>
+        <w:t>The data are used under the CC BY-NC 3.0 licence [8] for this non-commercial college project, with attribution to Piczak [6], [7].</w:t>
       </w:r>
     </w:p>
     <w:p>
@@ -1032,7 +1032,7 @@
           <w:i/>
           <w:sz w:val="20"/>
         </w:rPr>
-        <w:t>Base paper: Nolasco et al. [17]. Its title, author list, journal, volume, article number and DOI were checked against repository records (journal volume 77, article 102258); the paper is freely available as an arXiv preprint. Its content is described here from its abstract and from the descriptions of its template-matching baseline; the full text was not read in this session, so no detailed result of that paper is quoted. [18] is a July 2026 preprint, summarised from its abstract only. The other entries are listed from latest to oldest and summarise what each source is known for, not a full-text review.</w:t>
+        <w:t>Base paper: Tutul, Buchem and Pinkwart [1] (arXiv:2607.16299, July 2026), an open-access preprint (title, authors, arXiv number and date checked against its arXiv listing; its content is summarised from its abstract and listing only, the full text was not read, and as a preprint it is not peer reviewed). All other papers are from 2020 to 2023, so none is newer than the base paper; they are listed from latest to oldest and are summarised from abstract-level descriptions, not full-text reviews. The dataset paper [6] appears in the references only as the source of the data and is not part of this comparison.</w:t>
       </w:r>
     </w:p>
     <w:p>
@@ -1045,7 +1045,7 @@
           <w:i w:val="0"/>
           <w:sz w:val="20"/>
         </w:rPr>
-        <w:t>Table 2: Comparative study (base paper first; then latest to oldest).</w:t>
+        <w:t>Table 2: Comparative study (base paper first; then latest to oldest; all from 2020 or later).</w:t>
       </w:r>
     </w:p>
     <w:tbl>
@@ -1058,10 +1058,10 @@
       </w:tblPr>
       <w:tblGrid>
         <w:gridCol w:w="2160"/>
-        <w:gridCol w:w="720"/>
+        <w:gridCol w:w="648"/>
         <w:gridCol w:w="1368"/>
-        <w:gridCol w:w="2880"/>
-        <w:gridCol w:w="2232"/>
+        <w:gridCol w:w="3024"/>
+        <w:gridCol w:w="2160"/>
       </w:tblGrid>
       <w:tr>
         <w:trPr>
@@ -1089,7 +1089,7 @@
         </w:tc>
         <w:tc>
           <w:tcPr>
-            <w:tcW w:type="dxa" w:w="720"/>
+            <w:tcW w:type="dxa" w:w="648"/>
             <w:shd w:val="clear" w:color="auto" w:fill="DCE6F2"/>
           </w:tcPr>
           <w:p>
@@ -1127,7 +1127,7 @@
         </w:tc>
         <w:tc>
           <w:tcPr>
-            <w:tcW w:type="dxa" w:w="2880"/>
+            <w:tcW w:type="dxa" w:w="3024"/>
             <w:shd w:val="clear" w:color="auto" w:fill="DCE6F2"/>
           </w:tcPr>
           <w:p>
@@ -1146,7 +1146,7 @@
         </w:tc>
         <w:tc>
           <w:tcPr>
-            <w:tcW w:type="dxa" w:w="2232"/>
+            <w:tcW w:type="dxa" w:w="2160"/>
             <w:shd w:val="clear" w:color="auto" w:fill="DCE6F2"/>
           </w:tcPr>
           <w:p>
@@ -1184,13 +1184,118 @@
                 <w:i w:val="0"/>
                 <w:sz w:val="16"/>
               </w:rPr>
-              <w:t>Learning to detect an animal sound from five examples [17] (BASE PAPER)</w:t>
+              <w:t>Algorithmic Accuracy as a Motivational Driver in Robot-Mediated Learning: cross-correlation vs CNN sound detection [1] (BASE PAPER)</w:t>
             </w:r>
           </w:p>
         </w:tc>
         <w:tc>
           <w:tcPr>
-            <w:tcW w:type="dxa" w:w="720"/>
+            <w:tcW w:type="dxa" w:w="648"/>
+          </w:tcPr>
+          <w:p>
+            <w:pPr>
+              <w:keepNext/>
+              <w:spacing w:after="0"/>
+            </w:pPr>
+            <w:r/>
+            <w:r>
+              <w:rPr>
+                <w:b w:val="0"/>
+                <w:i w:val="0"/>
+                <w:sz w:val="16"/>
+              </w:rPr>
+              <w:t>2026</w:t>
+            </w:r>
+          </w:p>
+        </w:tc>
+        <w:tc>
+          <w:tcPr>
+            <w:tcW w:type="dxa" w:w="1368"/>
+          </w:tcPr>
+          <w:p>
+            <w:pPr>
+              <w:keepNext/>
+              <w:spacing w:after="0"/>
+            </w:pPr>
+            <w:r/>
+            <w:r>
+              <w:rPr>
+                <w:b w:val="0"/>
+                <w:i w:val="0"/>
+                <w:sz w:val="16"/>
+              </w:rPr>
+              <w:t>arXiv:2607.16299 (open-access preprint)</w:t>
+            </w:r>
+          </w:p>
+        </w:tc>
+        <w:tc>
+          <w:tcPr>
+            <w:tcW w:type="dxa" w:w="3024"/>
+          </w:tcPr>
+          <w:p>
+            <w:pPr>
+              <w:keepNext/>
+              <w:spacing w:after="0"/>
+            </w:pPr>
+            <w:r/>
+            <w:r>
+              <w:rPr>
+                <w:b w:val="0"/>
+                <w:i w:val="0"/>
+                <w:sz w:val="16"/>
+              </w:rPr>
+              <w:t>Detects a stored sound in live audio with a normalised correlation coefficient compared against a fixed threshold (no training), and compares it with a CNN detector in a classroom quiz game; reports that the cross-correlation detector worked better in that setting.</w:t>
+            </w:r>
+          </w:p>
+        </w:tc>
+        <w:tc>
+          <w:tcPr>
+            <w:tcW w:type="dxa" w:w="2160"/>
+          </w:tcPr>
+          <w:p>
+            <w:pPr>
+              <w:keepNext/>
+              <w:spacing w:after="0"/>
+            </w:pPr>
+            <w:r/>
+            <w:r>
+              <w:rPr>
+                <w:b w:val="0"/>
+                <w:i w:val="0"/>
+                <w:sz w:val="16"/>
+              </w:rPr>
+              <w:t>Detects one fixed, stereotyped sound and mainly studies learner motivation. This project measures precision, recall and F1 of NCC against known clip positions and shows where it fails (different recordings of one class).</w:t>
+            </w:r>
+          </w:p>
+        </w:tc>
+      </w:tr>
+      <w:tr>
+        <w:trPr>
+          <w:cantSplit w:val="true"/>
+        </w:trPr>
+        <w:tc>
+          <w:tcPr>
+            <w:tcW w:type="dxa" w:w="2160"/>
+          </w:tcPr>
+          <w:p>
+            <w:pPr>
+              <w:keepNext/>
+              <w:spacing w:after="0"/>
+            </w:pPr>
+            <w:r/>
+            <w:r>
+              <w:rPr>
+                <w:b w:val="0"/>
+                <w:i w:val="0"/>
+                <w:sz w:val="16"/>
+              </w:rPr>
+              <w:t>Learning to detect an animal sound from five examples [2]</w:t>
+            </w:r>
+          </w:p>
+        </w:tc>
+        <w:tc>
+          <w:tcPr>
+            <w:tcW w:type="dxa" w:w="648"/>
           </w:tcPr>
           <w:p>
             <w:pPr>
@@ -1224,13 +1329,13 @@
                 <w:i w:val="0"/>
                 <w:sz w:val="16"/>
               </w:rPr>
-              <w:t>Ecological Informatics 77, 102258; doi:10.1016/j.ecoinf.2023.102258; arXiv:2305.13210 (open)</w:t>
+              <w:t>Ecological Informatics 77, 102258; arXiv:2305.13210</w:t>
             </w:r>
           </w:p>
         </w:tc>
         <w:tc>
           <w:tcPr>
-            <w:tcW w:type="dxa" w:w="2880"/>
+            <w:tcW w:type="dxa" w:w="3024"/>
           </w:tcPr>
           <w:p>
             <w:pPr>
@@ -1244,13 +1349,13 @@
                 <w:i w:val="0"/>
                 <w:sz w:val="16"/>
               </w:rPr>
-              <w:t>Treats sound event detection from only a few examples of the target sound, which is exactly the one-example setting of this project. Uses spectrogram cross-correlation template matching as a traditional baseline and reports that few-shot learning outperforms such signal-processing detectors.</w:t>
+              <w:t>Sound event detection from only a few examples of the target sound; uses spectrogram cross-correlation template matching as a traditional baseline and reports that few-shot learning outperforms such signal-processing detectors.</w:t>
             </w:r>
           </w:p>
         </w:tc>
         <w:tc>
           <w:tcPr>
-            <w:tcW w:type="dxa" w:w="2232"/>
+            <w:tcW w:type="dxa" w:w="2160"/>
           </w:tcPr>
           <w:p>
             <w:pPr>
@@ -1264,7 +1369,7 @@
                 <w:i w:val="0"/>
                 <w:sz w:val="16"/>
               </w:rPr>
-              <w:t>Our waveform NCC shows the same limitation: it finds exact repeats but not different instances. Natural next steps: correlate spectrograms or learned embeddings instead of raw samples.</w:t>
+              <w:t>Suggests the next step for this project: correlate spectrograms or learned embeddings instead of raw waveforms.</w:t>
             </w:r>
           </w:p>
         </w:tc>
@@ -1289,13 +1394,13 @@
                 <w:i w:val="0"/>
                 <w:sz w:val="16"/>
               </w:rPr>
-              <w:t>Algorithmic Accuracy as a Motivational Driver in Robot-Mediated Learning (cross-correlation vs CNN sound detection) [18]</w:t>
+              <w:t>Few-shot bioacoustic event detection at the DCASE 2022 challenge [3]</w:t>
             </w:r>
           </w:p>
         </w:tc>
         <w:tc>
           <w:tcPr>
-            <w:tcW w:type="dxa" w:w="720"/>
+            <w:tcW w:type="dxa" w:w="648"/>
           </w:tcPr>
           <w:p>
             <w:pPr>
@@ -1309,7 +1414,7 @@
                 <w:i w:val="0"/>
                 <w:sz w:val="16"/>
               </w:rPr>
-              <w:t>2026</w:t>
+              <w:t>2022</w:t>
             </w:r>
           </w:p>
         </w:tc>
@@ -1329,13 +1434,13 @@
                 <w:i w:val="0"/>
                 <w:sz w:val="16"/>
               </w:rPr>
-              <w:t>arXiv:2607.16299 (preprint)</w:t>
+              <w:t>arXiv preprint (July 2022)</w:t>
             </w:r>
           </w:p>
         </w:tc>
         <w:tc>
           <w:tcPr>
-            <w:tcW w:type="dxa" w:w="2880"/>
+            <w:tcW w:type="dxa" w:w="3024"/>
           </w:tcPr>
           <w:p>
             <w:pPr>
@@ -1349,13 +1454,13 @@
                 <w:i w:val="0"/>
                 <w:sz w:val="16"/>
               </w:rPr>
-              <w:t>Uses a normalised-cross-correlation detector with a fixed threshold against a stored reference sound to detect buzzer sounds, and compares it with a CNN in a classroom game.</w:t>
+              <w:t>Overview of a community challenge on detecting a target sound from a few labelled examples, with datasets, baselines and submitted systems (the strongest used prototypical networks and transductive learning).</w:t>
             </w:r>
           </w:p>
         </w:tc>
         <w:tc>
           <w:tcPr>
-            <w:tcW w:type="dxa" w:w="2232"/>
+            <w:tcW w:type="dxa" w:w="2160"/>
           </w:tcPr>
           <w:p>
             <w:pPr>
@@ -1369,7 +1474,7 @@
                 <w:i w:val="0"/>
                 <w:sz w:val="16"/>
               </w:rPr>
-              <w:t>Preprint, abstract-level reading only; its claims are not independently checked here. Detection of one fixed, stereotyped sound, not different instances of a class.</w:t>
+              <w:t>Shows few-shot detection is still open; this project covers only the simplest one-template case.</w:t>
             </w:r>
           </w:p>
         </w:tc>
@@ -1394,13 +1499,13 @@
                 <w:i w:val="0"/>
                 <w:sz w:val="16"/>
               </w:rPr>
-              <w:t>ESC: Dataset for Environmental Sound Classification [1], with the ESC-50 data [2]</w:t>
+              <w:t>AST: Audio Spectrogram Transformer [4]</w:t>
             </w:r>
           </w:p>
         </w:tc>
         <w:tc>
           <w:tcPr>
-            <w:tcW w:type="dxa" w:w="720"/>
+            <w:tcW w:type="dxa" w:w="648"/>
           </w:tcPr>
           <w:p>
             <w:pPr>
@@ -1414,7 +1519,7 @@
                 <w:i w:val="0"/>
                 <w:sz w:val="16"/>
               </w:rPr>
-              <w:t>2015</w:t>
+              <w:t>2021</w:t>
             </w:r>
           </w:p>
         </w:tc>
@@ -1434,13 +1539,13 @@
                 <w:i w:val="0"/>
                 <w:sz w:val="16"/>
               </w:rPr>
-              <w:t>ACM Multimedia; GitHub</w:t>
+              <w:t>Interspeech 2021; arXiv:2104.01778</w:t>
             </w:r>
           </w:p>
         </w:tc>
         <w:tc>
           <w:tcPr>
-            <w:tcW w:type="dxa" w:w="2880"/>
+            <w:tcW w:type="dxa" w:w="3024"/>
           </w:tcPr>
           <w:p>
             <w:pPr>
@@ -1454,35 +1559,10 @@
                 <w:i w:val="0"/>
                 <w:sz w:val="16"/>
               </w:rPr>
-              <w:t>Supplies 2,000 labelled 5 s clips in 50 classes with a metadata file and fold assignment; the common benchmark for environmental sounds and the data used here.</w:t>
+              <w:t>A purely attention-based classifier on spectrograms that reports 95.6 % accuracy on ESC-50, the dataset used here.</w:t>
             </w:r>
           </w:p>
         </w:tc>
-        <w:tc>
-          <w:tcPr>
-            <w:tcW w:type="dxa" w:w="2232"/>
-          </w:tcPr>
-          <w:p>
-            <w:pPr>
-              <w:keepNext/>
-              <w:spacing w:after="0"/>
-            </w:pPr>
-            <w:r/>
-            <w:r>
-              <w:rPr>
-                <w:b w:val="0"/>
-                <w:i w:val="0"/>
-                <w:sz w:val="16"/>
-              </w:rPr>
-              <w:t>Built for classification, not detection in long recordings; this project adds recordings with known clip positions.</w:t>
-            </w:r>
-          </w:p>
-        </w:tc>
-      </w:tr>
-      <w:tr>
-        <w:trPr>
-          <w:cantSplit w:val="true"/>
-        </w:trPr>
         <w:tc>
           <w:tcPr>
             <w:tcW w:type="dxa" w:w="2160"/>
@@ -1499,297 +1579,7 @@
                 <w:i w:val="0"/>
                 <w:sz w:val="16"/>
               </w:rPr>
-              <w:t>Fundamentals of Radar Signal Processing, 2nd ed. [4]</w:t>
-            </w:r>
-          </w:p>
-        </w:tc>
-        <w:tc>
-          <w:tcPr>
-            <w:tcW w:type="dxa" w:w="720"/>
-          </w:tcPr>
-          <w:p>
-            <w:pPr>
-              <w:keepNext/>
-              <w:spacing w:after="0"/>
-            </w:pPr>
-            <w:r/>
-            <w:r>
-              <w:rPr>
-                <w:b w:val="0"/>
-                <w:i w:val="0"/>
-                <w:sz w:val="16"/>
-              </w:rPr>
-              <w:t>2014</w:t>
-            </w:r>
-          </w:p>
-        </w:tc>
-        <w:tc>
-          <w:tcPr>
-            <w:tcW w:type="dxa" w:w="1368"/>
-          </w:tcPr>
-          <w:p>
-            <w:pPr>
-              <w:keepNext/>
-              <w:spacing w:after="0"/>
-            </w:pPr>
-            <w:r/>
-            <w:r>
-              <w:rPr>
-                <w:b w:val="0"/>
-                <w:i w:val="0"/>
-                <w:sz w:val="16"/>
-              </w:rPr>
-              <w:t>McGraw-Hill (book)</w:t>
-            </w:r>
-          </w:p>
-        </w:tc>
-        <w:tc>
-          <w:tcPr>
-            <w:tcW w:type="dxa" w:w="2880"/>
-          </w:tcPr>
-          <w:p>
-            <w:pPr>
-              <w:keepNext/>
-              <w:spacing w:after="0"/>
-            </w:pPr>
-            <w:r/>
-            <w:r>
-              <w:rPr>
-                <w:b w:val="0"/>
-                <w:i w:val="0"/>
-                <w:sz w:val="16"/>
-              </w:rPr>
-              <w:t>Derives the matched filter and its implementation by correlation; basis for the correlation and normalisation used here.</w:t>
-            </w:r>
-          </w:p>
-        </w:tc>
-        <w:tc>
-          <w:tcPr>
-            <w:tcW w:type="dxa" w:w="2232"/>
-          </w:tcPr>
-          <w:p>
-            <w:pPr>
-              <w:keepNext/>
-              <w:spacing w:after="0"/>
-            </w:pPr>
-            <w:r/>
-            <w:r>
-              <w:rPr>
-                <w:b w:val="0"/>
-                <w:i w:val="0"/>
-                <w:sz w:val="16"/>
-              </w:rPr>
-              <w:t>Written for radar; sounds are not known-shape signals in white noise, so the optimality argument only partly carries over.</w:t>
-            </w:r>
-          </w:p>
-        </w:tc>
-      </w:tr>
-      <w:tr>
-        <w:trPr>
-          <w:cantSplit w:val="true"/>
-        </w:trPr>
-        <w:tc>
-          <w:tcPr>
-            <w:tcW w:type="dxa" w:w="2160"/>
-          </w:tcPr>
-          <w:p>
-            <w:pPr>
-              <w:keepNext/>
-              <w:spacing w:after="0"/>
-            </w:pPr>
-            <w:r/>
-            <w:r>
-              <w:rPr>
-                <w:b w:val="0"/>
-                <w:i w:val="0"/>
-                <w:sz w:val="16"/>
-              </w:rPr>
-              <w:t>Principles of Modern Radar: Basic Principles [5]</w:t>
-            </w:r>
-          </w:p>
-        </w:tc>
-        <w:tc>
-          <w:tcPr>
-            <w:tcW w:type="dxa" w:w="720"/>
-          </w:tcPr>
-          <w:p>
-            <w:pPr>
-              <w:keepNext/>
-              <w:spacing w:after="0"/>
-            </w:pPr>
-            <w:r/>
-            <w:r>
-              <w:rPr>
-                <w:b w:val="0"/>
-                <w:i w:val="0"/>
-                <w:sz w:val="16"/>
-              </w:rPr>
-              <w:t>2010</w:t>
-            </w:r>
-          </w:p>
-        </w:tc>
-        <w:tc>
-          <w:tcPr>
-            <w:tcW w:type="dxa" w:w="1368"/>
-          </w:tcPr>
-          <w:p>
-            <w:pPr>
-              <w:keepNext/>
-              <w:spacing w:after="0"/>
-            </w:pPr>
-            <w:r/>
-            <w:r>
-              <w:rPr>
-                <w:b w:val="0"/>
-                <w:i w:val="0"/>
-                <w:sz w:val="16"/>
-              </w:rPr>
-              <w:t>SciTech (book)</w:t>
-            </w:r>
-          </w:p>
-        </w:tc>
-        <w:tc>
-          <w:tcPr>
-            <w:tcW w:type="dxa" w:w="2880"/>
-          </w:tcPr>
-          <w:p>
-            <w:pPr>
-              <w:keepNext/>
-              <w:spacing w:after="0"/>
-            </w:pPr>
-            <w:r/>
-            <w:r>
-              <w:rPr>
-                <w:b w:val="0"/>
-                <w:i w:val="0"/>
-                <w:sz w:val="16"/>
-              </w:rPr>
-              <w:t>Reference for correlation-based detection and detection thresholds.</w:t>
-            </w:r>
-          </w:p>
-        </w:tc>
-        <w:tc>
-          <w:tcPr>
-            <w:tcW w:type="dxa" w:w="2232"/>
-          </w:tcPr>
-          <w:p>
-            <w:pPr>
-              <w:keepNext/>
-              <w:spacing w:after="0"/>
-            </w:pPr>
-            <w:r/>
-            <w:r>
-              <w:rPr>
-                <w:b w:val="0"/>
-                <w:i w:val="0"/>
-                <w:sz w:val="16"/>
-              </w:rPr>
-              <w:t>General reference.</w:t>
-            </w:r>
-          </w:p>
-        </w:tc>
-      </w:tr>
-      <w:tr>
-        <w:trPr>
-          <w:cantSplit w:val="true"/>
-        </w:trPr>
-        <w:tc>
-          <w:tcPr>
-            <w:tcW w:type="dxa" w:w="2160"/>
-          </w:tcPr>
-          <w:p>
-            <w:pPr>
-              <w:keepNext/>
-              <w:spacing w:after="0"/>
-            </w:pPr>
-            <w:r/>
-            <w:r>
-              <w:rPr>
-                <w:b w:val="0"/>
-                <w:i w:val="0"/>
-                <w:sz w:val="16"/>
-              </w:rPr>
-              <w:t>Radar Handbook, 3rd ed. [6]</w:t>
-            </w:r>
-          </w:p>
-        </w:tc>
-        <w:tc>
-          <w:tcPr>
-            <w:tcW w:type="dxa" w:w="720"/>
-          </w:tcPr>
-          <w:p>
-            <w:pPr>
-              <w:keepNext/>
-              <w:spacing w:after="0"/>
-            </w:pPr>
-            <w:r/>
-            <w:r>
-              <w:rPr>
-                <w:b w:val="0"/>
-                <w:i w:val="0"/>
-                <w:sz w:val="16"/>
-              </w:rPr>
-              <w:t>2008</w:t>
-            </w:r>
-          </w:p>
-        </w:tc>
-        <w:tc>
-          <w:tcPr>
-            <w:tcW w:type="dxa" w:w="1368"/>
-          </w:tcPr>
-          <w:p>
-            <w:pPr>
-              <w:keepNext/>
-              <w:spacing w:after="0"/>
-            </w:pPr>
-            <w:r/>
-            <w:r>
-              <w:rPr>
-                <w:b w:val="0"/>
-                <w:i w:val="0"/>
-                <w:sz w:val="16"/>
-              </w:rPr>
-              <w:t>McGraw-Hill (handbook)</w:t>
-            </w:r>
-          </w:p>
-        </w:tc>
-        <w:tc>
-          <w:tcPr>
-            <w:tcW w:type="dxa" w:w="2880"/>
-          </w:tcPr>
-          <w:p>
-            <w:pPr>
-              <w:keepNext/>
-              <w:spacing w:after="0"/>
-            </w:pPr>
-            <w:r/>
-            <w:r>
-              <w:rPr>
-                <w:b w:val="0"/>
-                <w:i w:val="0"/>
-                <w:sz w:val="16"/>
-              </w:rPr>
-              <w:t>Broad reference on matched filtering and threshold detection.</w:t>
-            </w:r>
-          </w:p>
-        </w:tc>
-        <w:tc>
-          <w:tcPr>
-            <w:tcW w:type="dxa" w:w="2232"/>
-          </w:tcPr>
-          <w:p>
-            <w:pPr>
-              <w:keepNext/>
-              <w:spacing w:after="0"/>
-            </w:pPr>
-            <w:r/>
-            <w:r>
-              <w:rPr>
-                <w:b w:val="0"/>
-                <w:i w:val="0"/>
-                <w:sz w:val="16"/>
-              </w:rPr>
-              <w:t>General reference.</w:t>
+              <w:t>Needs labelled training data and classifies whole clips; it does not locate a sound inside a long recording.</w:t>
             </w:r>
           </w:p>
         </w:tc>
@@ -1813,13 +1603,13 @@
                 <w:i w:val="0"/>
                 <w:sz w:val="16"/>
               </w:rPr>
-              <w:t>Matched Filter and Pulse Compression (Scientific Python course) [7]</w:t>
+              <w:t>PANNs: Large-Scale Pretrained Audio Neural Networks for Audio Pattern Recognition [5]</w:t>
             </w:r>
           </w:p>
         </w:tc>
         <w:tc>
           <w:tcPr>
-            <w:tcW w:type="dxa" w:w="720"/>
+            <w:tcW w:type="dxa" w:w="648"/>
           </w:tcPr>
           <w:p>
             <w:pPr>
@@ -1832,7 +1622,7 @@
                 <w:i w:val="0"/>
                 <w:sz w:val="16"/>
               </w:rPr>
-              <w:t>undated</w:t>
+              <w:t>2020</w:t>
             </w:r>
           </w:p>
         </w:tc>
@@ -1851,13 +1641,13 @@
                 <w:i w:val="0"/>
                 <w:sz w:val="16"/>
               </w:rPr>
-              <w:t>TU Berlin course material</w:t>
+              <w:t>IEEE/ACM TASLP 28, 2880-2894</w:t>
             </w:r>
           </w:p>
         </w:tc>
         <w:tc>
           <w:tcPr>
-            <w:tcW w:type="dxa" w:w="2880"/>
+            <w:tcW w:type="dxa" w:w="3024"/>
           </w:tcPr>
           <w:p>
             <w:pPr>
@@ -1870,13 +1660,13 @@
                 <w:i w:val="0"/>
                 <w:sz w:val="16"/>
               </w:rPr>
-              <w:t>Python explanation of correlation by FFT, used to cross-check the implementation approach.</w:t>
+              <w:t>Networks pretrained on a large audio collection and transferred to other audio tasks, showing that learned features beat hand-crafted ones on many tasks.</w:t>
             </w:r>
           </w:p>
         </w:tc>
         <w:tc>
           <w:tcPr>
-            <w:tcW w:type="dxa" w:w="2232"/>
+            <w:tcW w:type="dxa" w:w="2160"/>
           </w:tcPr>
           <w:p>
             <w:pPr>
@@ -1889,7 +1679,7 @@
                 <w:i w:val="0"/>
                 <w:sz w:val="16"/>
               </w:rPr>
-              <w:t>No normalisation or detection scoring.</w:t>
+              <w:t>Pretraining needs large data and compute; this project is a training-free baseline.</w:t>
             </w:r>
           </w:p>
         </w:tc>
@@ -2071,7 +1861,7 @@
           <w:b w:val="0"/>
           <w:i w:val="0"/>
         </w:rPr>
-        <w:t>Each clip is converted to mono, resampled from 44.1 kHz to 16 kHz with a polyphase filter [9], scaled so that its peak is 1, and stripped of the digital-silence padding ESC-50 adds to short events (samples below 0.1 % of the peak at the start and end are removed).</w:t>
+        <w:t>Each clip is converted to mono, resampled from 44.1 kHz to 16 kHz with a polyphase filter [11], scaled so that its peak is 1, and stripped of the digital-silence padding ESC-50 adds to short events (samples below 0.1 % of the peak at the start and end are removed).</w:t>
       </w:r>
     </w:p>
     <w:p>
@@ -2133,7 +1923,7 @@
           <w:b w:val="0"/>
           <w:i w:val="0"/>
         </w:rPr>
-        <w:t>For template t of length m and recording x, the score at lag k is  c[k] = sum_n x[k+n] t[n] / ( sqrt(sum_n x[k+n]^2) x sqrt(sum_n t[n]^2) ). The numerator for all lags is one FFT-based correlation (zero-padded, so linear), IFFT( FFT(x) x conj(FFT(t)) ) [8]. The window energy in the denominator is a difference of a running sum of x^2. The score lies in [-1, 1]; 1 means the window is a scaled copy of the template. Windows with almost no energy (silence) are given score 0 so that quiet gaps cannot score highly.</w:t>
+        <w:t>For template t of length m and recording x, the score at lag k is  c[k] = sum_n x[k+n] t[n] / ( sqrt(sum_n x[k+n]^2) x sqrt(sum_n t[n]^2) ). The numerator for all lags is one FFT-based correlation (zero-padded, so linear), IFFT( FFT(x) x conj(FFT(t)) ) [10]. The window energy in the denominator is a difference of a running sum of x^2. The score lies in [-1, 1]; 1 means the window is a scaled copy of the template. Windows with almost no energy (silence) are given score 0 so that quiet gaps cannot score highly.</w:t>
       </w:r>
     </w:p>
     <w:p>
@@ -2365,7 +2155,7 @@
                 <w:i w:val="0"/>
                 <w:sz w:val="18"/>
               </w:rPr>
-              <w:t>[15]</w:t>
+              <w:t>[17]</w:t>
             </w:r>
           </w:p>
         </w:tc>
@@ -2430,7 +2220,7 @@
                 <w:i w:val="0"/>
                 <w:sz w:val="18"/>
               </w:rPr>
-              <w:t>[8]</w:t>
+              <w:t>[10]</w:t>
             </w:r>
           </w:p>
         </w:tc>
@@ -2495,7 +2285,7 @@
                 <w:i w:val="0"/>
                 <w:sz w:val="18"/>
               </w:rPr>
-              <w:t>[9]</w:t>
+              <w:t>[11]</w:t>
             </w:r>
           </w:p>
         </w:tc>
@@ -2560,7 +2350,7 @@
                 <w:i w:val="0"/>
                 <w:sz w:val="18"/>
               </w:rPr>
-              <w:t>[10]</w:t>
+              <w:t>[12]</w:t>
             </w:r>
           </w:p>
         </w:tc>
@@ -2625,7 +2415,7 @@
                 <w:i w:val="0"/>
                 <w:sz w:val="18"/>
               </w:rPr>
-              <w:t>[11]</w:t>
+              <w:t>[13]</w:t>
             </w:r>
           </w:p>
         </w:tc>
@@ -2690,7 +2480,7 @@
                 <w:i w:val="0"/>
                 <w:sz w:val="18"/>
               </w:rPr>
-              <w:t>[12]</w:t>
+              <w:t>[14]</w:t>
             </w:r>
           </w:p>
         </w:tc>
@@ -2752,7 +2542,7 @@
                 <w:i w:val="0"/>
                 <w:sz w:val="18"/>
               </w:rPr>
-              <w:t>[13], [14]</w:t>
+              <w:t>[15], [16]</w:t>
             </w:r>
           </w:p>
         </w:tc>
@@ -5220,7 +5010,7 @@
           <w:b w:val="0"/>
           <w:i w:val="0"/>
         </w:rPr>
-        <w:t>Scores of true and other-class clips overlap strongly (Section 6.3), so a better representation (for example spectrogram features or learned few-shot models, as in the base paper [17]) would be needed to recognise a class from one example; that is outside this project's scope.</w:t>
+        <w:t>Scores of true and other-class clips overlap strongly (Section 6.3), so a better representation (for example spectrogram features or learned few-shot models, as in [2], [3]) would be needed to recognise a class from one example; that is outside this project's scope.</w:t>
       </w:r>
     </w:p>
     <w:p>
@@ -5290,7 +5080,7 @@
         </w:rPr>
         <w:t>[1]</w:t>
         <w:tab/>
-        <w:t>K. J. Piczak, "ESC: Dataset for Environmental Sound Classification", Proc. 23rd ACM International Conference on Multimedia (ACM Multimedia), 2015.</w:t>
+        <w:t>R. Tutul, I. Buchem and N. Pinkwart, "Algorithmic Accuracy as a Motivational Driver in Robot-Mediated Learning: A Comparative Study of Cross-Correlation and CNN-Based Sound Detection in an Interactive Quiz Game", arXiv:2607.16299, July 2026 (open-access preprint; BASE PAPER).</w:t>
       </w:r>
     </w:p>
     <w:p>
@@ -5308,7 +5098,7 @@
         </w:rPr>
         <w:t>[2]</w:t>
         <w:tab/>
-        <w:t>K. J. Piczak, ESC-50: Dataset for Environmental Sound Classification (2,000 clips, 50 classes), github.com/karolpiczak/ESC-50.</w:t>
+        <w:t>I. Nolasco, S. Singh, V. Morfi, V. Lostanlen, A. Strandburg-Peshkin, E. Vidana-Vila, L. Gill, H. Pamula, H. Whitehead, I. Kiskin, F. H. Jensen, J. Morford, M. G. Emmerson, E. Versace, E. Grout, H. Liu, B. Ghani and D. Stowell, "Learning to detect an animal sound from five examples", Ecological Informatics, vol. 77, art. 102258, 2023, doi:10.1016/j.ecoinf.2023.102258 (also arXiv:2305.13210).</w:t>
       </w:r>
     </w:p>
     <w:p>
@@ -5326,7 +5116,7 @@
         </w:rPr>
         <w:t>[3]</w:t>
         <w:tab/>
-        <w:t>Creative Commons Attribution-NonCommercial 3.0 licence (CC BY-NC 3.0), creativecommons.org/licenses/by-nc/3.0/.</w:t>
+        <w:t>I. Nolasco et al., "Few-shot bioacoustic event detection at the DCASE 2022 challenge", arXiv preprint, July 2022.</w:t>
       </w:r>
     </w:p>
     <w:p>
@@ -5344,7 +5134,7 @@
         </w:rPr>
         <w:t>[4]</w:t>
         <w:tab/>
-        <w:t>M. A. Richards, Fundamentals of Radar Signal Processing, 2nd ed., McGraw-Hill, 2014.</w:t>
+        <w:t>Y. Gong, Y.-A. Chung and J. Glass, "AST: Audio Spectrogram Transformer", Proc. Interspeech, 2021, arXiv:2104.01778.</w:t>
       </w:r>
     </w:p>
     <w:p>
@@ -5362,7 +5152,7 @@
         </w:rPr>
         <w:t>[5]</w:t>
         <w:tab/>
-        <w:t>M. A. Richards, J. A. Scheer and W. A. Holm (eds.), Principles of Modern Radar: Basic Principles, SciTech Publishing, 2010.</w:t>
+        <w:t>Q. Kong, Y. Cao, T. Iqbal, Y. Wang, W. Wang and M. D. Plumbley, "PANNs: Large-Scale Pretrained Audio Neural Networks for Audio Pattern Recognition", IEEE/ACM Trans. Audio, Speech, and Language Processing, vol. 28, pp. 2880-2894, 2020, doi:10.1109/TASLP.2020.3030497.</w:t>
       </w:r>
     </w:p>
     <w:p>
@@ -5380,7 +5170,7 @@
         </w:rPr>
         <w:t>[6]</w:t>
         <w:tab/>
-        <w:t>M. I. Skolnik, Radar Handbook, 3rd ed., McGraw-Hill, 2008.</w:t>
+        <w:t>K. J. Piczak, "ESC: Dataset for Environmental Sound Classification", Proc. 23rd ACM International Conference on Multimedia (ACM Multimedia), 2015 (cited only as the source of the dataset).</w:t>
       </w:r>
     </w:p>
     <w:p>
@@ -5398,7 +5188,7 @@
         </w:rPr>
         <w:t>[7]</w:t>
         <w:tab/>
-        <w:t>TU Berlin, "Matched Filter and Pulse Compression", chapter of the Scientific Python course, platform.commit.tu-berlin.de/en/book/sci-python/chapter/ch25/section/s01.</w:t>
+        <w:t>K. J. Piczak, ESC-50: Dataset for Environmental Sound Classification (2,000 clips, 50 classes), github.com/karolpiczak/ESC-50.</w:t>
       </w:r>
     </w:p>
     <w:p>
@@ -5416,7 +5206,7 @@
         </w:rPr>
         <w:t>[8]</w:t>
         <w:tab/>
-        <w:t>NumPy documentation, numpy.org/doc/.</w:t>
+        <w:t>Creative Commons Attribution-NonCommercial 3.0 licence (CC BY-NC 3.0), creativecommons.org/licenses/by-nc/3.0/.</w:t>
       </w:r>
     </w:p>
     <w:p>
@@ -5434,7 +5224,7 @@
         </w:rPr>
         <w:t>[9]</w:t>
         <w:tab/>
-        <w:t>SciPy documentation (scipy.io.wavfile, scipy.signal.resample_poly), docs.scipy.org/doc/scipy/.</w:t>
+        <w:t>Freesound, the online sound database from which ESC-50 clips were extracted, freesound.org.</w:t>
       </w:r>
     </w:p>
     <w:p>
@@ -5452,7 +5242,7 @@
         </w:rPr>
         <w:t>[10]</w:t>
         <w:tab/>
-        <w:t>Matplotlib documentation, matplotlib.org/stable/.</w:t>
+        <w:t>NumPy documentation, numpy.org/doc/.</w:t>
       </w:r>
     </w:p>
     <w:p>
@@ -5470,7 +5260,7 @@
         </w:rPr>
         <w:t>[11]</w:t>
         <w:tab/>
-        <w:t>Streamlit documentation, docs.streamlit.io.</w:t>
+        <w:t>SciPy documentation (scipy.io.wavfile, scipy.signal.resample_poly), docs.scipy.org/doc/scipy/.</w:t>
       </w:r>
     </w:p>
     <w:p>
@@ -5488,7 +5278,7 @@
         </w:rPr>
         <w:t>[12]</w:t>
         <w:tab/>
-        <w:t>pytest documentation, docs.pytest.org.</w:t>
+        <w:t>Matplotlib documentation, matplotlib.org/stable/.</w:t>
       </w:r>
     </w:p>
     <w:p>
@@ -5506,7 +5296,7 @@
         </w:rPr>
         <w:t>[13]</w:t>
         <w:tab/>
-        <w:t>python-docx documentation, python-docx.readthedocs.io.</w:t>
+        <w:t>Streamlit documentation, docs.streamlit.io.</w:t>
       </w:r>
     </w:p>
     <w:p>
@@ -5524,7 +5314,7 @@
         </w:rPr>
         <w:t>[14]</w:t>
         <w:tab/>
-        <w:t>python-pptx documentation, python-pptx.readthedocs.io.</w:t>
+        <w:t>pytest documentation, docs.pytest.org.</w:t>
       </w:r>
     </w:p>
     <w:p>
@@ -5542,7 +5332,7 @@
         </w:rPr>
         <w:t>[15]</w:t>
         <w:tab/>
-        <w:t>Python standard library documentation (csv, zipfile, urllib), docs.python.org/3/library/.</w:t>
+        <w:t>python-docx documentation, python-docx.readthedocs.io.</w:t>
       </w:r>
     </w:p>
     <w:p>
@@ -5560,7 +5350,7 @@
         </w:rPr>
         <w:t>[16]</w:t>
         <w:tab/>
-        <w:t>Freesound, the online sound database from which ESC-50 clips were extracted, freesound.org.</w:t>
+        <w:t>python-pptx documentation, python-pptx.readthedocs.io.</w:t>
       </w:r>
     </w:p>
     <w:p>
@@ -5578,25 +5368,7 @@
         </w:rPr>
         <w:t>[17]</w:t>
         <w:tab/>
-        <w:t>I. Nolasco, S. Singh, V. Morfi, V. Lostanlen, A. Strandburg-Peshkin, E. Vidana-Vila, L. Gill, H. Pamula, H. Whitehead, I. Kiskin, F. H. Jensen, J. Morford, M. G. Emmerson, E. Versace, E. Grout, H. Liu, B. Ghani and D. Stowell, "Learning to detect an animal sound from five examples", Ecological Informatics, vol. 77, art. 102258, 2023, doi:10.1016/j.ecoinf.2023.102258 (BASE PAPER; also on arXiv:2305.13210).</w:t>
-      </w:r>
-    </w:p>
-    <w:p>
-      <w:pPr>
-        <w:tabs>
-          <w:tab w:pos="576" w:val="left"/>
-        </w:tabs>
-        <w:ind w:left="576" w:hanging="576"/>
-      </w:pPr>
-      <w:r>
-        <w:rPr>
-          <w:b w:val="0"/>
-          <w:i w:val="0"/>
-          <w:sz w:val="20"/>
-        </w:rPr>
-        <w:t>[18]</w:t>
-        <w:tab/>
-        <w:t>R. Tutul, I. Buchem and N. Pinkwart, "Algorithmic Accuracy as a Motivational Driver in Robot-Mediated Learning: A Comparative Study of Cross-Correlation and CNN-Based Sound Detection in an Interactive Quiz Game", arXiv:2607.16299, July 2026 (preprint).</w:t>
+        <w:t>Python standard library documentation (csv, zipfile, urllib), docs.python.org/3/library/.</w:t>
       </w:r>
     </w:p>
     <w:sectPr>

</xml_diff>

<commit_message>
Fill in student, guide, department, institute and year in ESC-50 report and slides
Co-Authored-By: Claude Sonnet 5.5 <noreply@anthropic.com>
Claude-Session: https://claude.ai/code/session_012DKUQj8phYpnuRrxK5eNsm
</commit_message>
<xml_diff>
--- a/esc50_matching/docs/report.docx
+++ b/esc50_matching/docs/report.docx
@@ -58,16 +58,7 @@
           <w:i w:val="0"/>
           <w:sz w:val="26"/>
         </w:rPr>
-        <w:t xml:space="preserve">Student name: </w:t>
-      </w:r>
-      <w:r>
-        <w:rPr>
-          <w:b w:val="0"/>
-          <w:i w:val="0"/>
-          <w:sz w:val="26"/>
-          <w:highlight w:val="yellow"/>
-        </w:rPr>
-        <w:t>[Student name]</w:t>
+        <w:t>Submitted by: Zion Naranje (Roll No. 09)</w:t>
       </w:r>
     </w:p>
     <w:p>
@@ -80,16 +71,7 @@
           <w:i w:val="0"/>
           <w:sz w:val="26"/>
         </w:rPr>
-        <w:t xml:space="preserve">Roll no: </w:t>
-      </w:r>
-      <w:r>
-        <w:rPr>
-          <w:b w:val="0"/>
-          <w:i w:val="0"/>
-          <w:sz w:val="26"/>
-          <w:highlight w:val="yellow"/>
-        </w:rPr>
-        <w:t>[Roll no]</w:t>
+        <w:t>Guide: Ms. Purvi Agarwal</w:t>
       </w:r>
     </w:p>
     <w:p>
@@ -102,16 +84,7 @@
           <w:i w:val="0"/>
           <w:sz w:val="26"/>
         </w:rPr>
-        <w:t xml:space="preserve">Guide name: </w:t>
-      </w:r>
-      <w:r>
-        <w:rPr>
-          <w:b w:val="0"/>
-          <w:i w:val="0"/>
-          <w:sz w:val="26"/>
-          <w:highlight w:val="yellow"/>
-        </w:rPr>
-        <w:t>[Guide name]</w:t>
+        <w:t>Department: Computer Engineering</w:t>
       </w:r>
     </w:p>
     <w:p>
@@ -124,16 +97,7 @@
           <w:i w:val="0"/>
           <w:sz w:val="26"/>
         </w:rPr>
-        <w:t xml:space="preserve">Department: </w:t>
-      </w:r>
-      <w:r>
-        <w:rPr>
-          <w:b w:val="0"/>
-          <w:i w:val="0"/>
-          <w:sz w:val="26"/>
-          <w:highlight w:val="yellow"/>
-        </w:rPr>
-        <w:t>[Department]</w:t>
+        <w:t>Institute: St. Francis Institute of Technology</w:t>
       </w:r>
     </w:p>
     <w:p>
@@ -146,38 +110,7 @@
           <w:i w:val="0"/>
           <w:sz w:val="26"/>
         </w:rPr>
-        <w:t xml:space="preserve">Institute: </w:t>
-      </w:r>
-      <w:r>
-        <w:rPr>
-          <w:b w:val="0"/>
-          <w:i w:val="0"/>
-          <w:sz w:val="26"/>
-          <w:highlight w:val="yellow"/>
-        </w:rPr>
-        <w:t>[Institute]</w:t>
-      </w:r>
-    </w:p>
-    <w:p>
-      <w:pPr>
-        <w:jc w:val="center"/>
-      </w:pPr>
-      <w:r>
-        <w:rPr>
-          <w:b w:val="0"/>
-          <w:i w:val="0"/>
-          <w:sz w:val="26"/>
-        </w:rPr>
-        <w:t xml:space="preserve">Academic year: </w:t>
-      </w:r>
-      <w:r>
-        <w:rPr>
-          <w:b w:val="0"/>
-          <w:i w:val="0"/>
-          <w:sz w:val="26"/>
-          <w:highlight w:val="yellow"/>
-        </w:rPr>
-        <w:t>[Academic year]</w:t>
+        <w:t>Academic Year: 2026-2027</w:t>
       </w:r>
     </w:p>
     <w:p>

</xml_diff>